<commit_message>
Embed audio/video inline, add Music round, switch to Segoe UI
- Switch the deck font from embedded Montserrat to Segoe UI / Segoe UI
  Black (Windows system fonts), so locked-down work Office installs that
  strip embedded fonts render the deck as intended.
- Embed the three video clips to play inline in PowerPoint instead of
  YouTube link pills; original URLs kept in the speaker notes as backup.
- Add a Music round (Name That Tune): five song excerpts embedded to play
  inline, each behind an on-brand poster frame, revealed with album art —
  all five tracks secretly about the sea (a nod to Čiurlionis's "Jūra").
- Organise the uploaded media into media/audio, media/video and photos/
  (song_*) with standardised names.
- Update the run-of-show docx and README to match (60 slides now).

https://claude.ai/code/session_01U5zUHYJvbm91p2C9snQASC
</commit_message>
<xml_diff>
--- a/Trivia_Night_2026-06-16_run_of_show.docx
+++ b/Trivia_Night_2026-06-16_run_of_show.docx
@@ -65,7 +65,7 @@
           <w:b w:val="0"/>
           <w:i w:val="0"/>
         </w:rPr>
-        <w:t>Three rounds plus a bonus round. One point per question unless marked otherwise.</w:t>
+        <w:t>Four rounds plus a bonus round. One point per question unless marked otherwise.</w:t>
       </w:r>
     </w:p>
     <w:p>
@@ -1618,6 +1618,405 @@
         <w:pStyle w:val="Heading1"/>
       </w:pPr>
       <w:r>
+        <w:t>Round 4 — Music (Name That Tune)</w:t>
+      </w:r>
+    </w:p>
+    <w:p>
+      <w:pPr>
+        <w:spacing w:after="120"/>
+      </w:pPr>
+      <w:r>
+        <w:rPr>
+          <w:b w:val="0"/>
+          <w:i/>
+          <w:color w:val="6E7582"/>
+        </w:rPr>
+        <w:t>5 songs · 1 point each · song excerpts embedded in the slides (click to play in PowerPoint)</w:t>
+      </w:r>
+    </w:p>
+    <w:p>
+      <w:pPr>
+        <w:spacing w:after="120"/>
+      </w:pPr>
+      <w:r>
+        <w:rPr>
+          <w:b w:val="0"/>
+          <w:i/>
+          <w:color w:val="6E7582"/>
+        </w:rPr>
+        <w:t>Hidden theme of the round: every track is about the sea — a nod to Čiurlionis's symphonic poem “Jūra”. Reveal the link at the end for an optional extra point.</w:t>
+      </w:r>
+    </w:p>
+    <w:p>
+      <w:pPr>
+        <w:pStyle w:val="Heading3"/>
+      </w:pPr>
+      <w:r>
+        <w:t>Question 1 of 5</w:t>
+      </w:r>
+    </w:p>
+    <w:p>
+      <w:pPr>
+        <w:spacing w:after="120"/>
+      </w:pPr>
+      <w:r>
+        <w:rPr>
+          <w:b w:val="0"/>
+          <w:i w:val="0"/>
+        </w:rPr>
+        <w:t>Name this song (play the excerpt). Bonus point for the artist.</w:t>
+      </w:r>
+    </w:p>
+    <w:p>
+      <w:pPr>
+        <w:spacing w:after="120"/>
+      </w:pPr>
+      <w:r>
+        <w:rPr>
+          <w:b/>
+        </w:rPr>
+        <w:t xml:space="preserve">Hint:  </w:t>
+      </w:r>
+      <w:r>
+        <w:rPr>
+          <w:i/>
+        </w:rPr>
+        <w:t>From a 2016 Disney film about a Pacific island voyager.</w:t>
+      </w:r>
+    </w:p>
+    <w:p>
+      <w:pPr>
+        <w:spacing w:after="120"/>
+      </w:pPr>
+      <w:r>
+        <w:rPr>
+          <w:b/>
+          <w:color w:val="A86A14"/>
+        </w:rPr>
+        <w:t xml:space="preserve">Answer:  </w:t>
+      </w:r>
+      <w:r>
+        <w:rPr>
+          <w:i w:val="0"/>
+          <w:color w:val="A86A14"/>
+        </w:rPr>
+        <w:t>“How Far I'll Go” — Auli'i Cravalho</w:t>
+      </w:r>
+    </w:p>
+    <w:p>
+      <w:pPr>
+        <w:spacing w:after="120"/>
+      </w:pPr>
+      <w:r>
+        <w:rPr>
+          <w:b/>
+        </w:rPr>
+        <w:t xml:space="preserve">Did you know?  </w:t>
+      </w:r>
+      <w:r>
+        <w:rPr>
+          <w:i w:val="0"/>
+        </w:rPr>
+        <w:t>From Disney's “Moana” (2016); the ocean keeps calling her past the reef.</w:t>
+      </w:r>
+    </w:p>
+    <w:p>
+      <w:pPr>
+        <w:pStyle w:val="Heading3"/>
+      </w:pPr>
+      <w:r>
+        <w:t>Question 2 of 5</w:t>
+      </w:r>
+    </w:p>
+    <w:p>
+      <w:pPr>
+        <w:spacing w:after="120"/>
+      </w:pPr>
+      <w:r>
+        <w:rPr>
+          <w:b w:val="0"/>
+          <w:i w:val="0"/>
+        </w:rPr>
+        <w:t>Name this song (play the excerpt). Bonus point for the artist.</w:t>
+      </w:r>
+    </w:p>
+    <w:p>
+      <w:pPr>
+        <w:spacing w:after="120"/>
+      </w:pPr>
+      <w:r>
+        <w:rPr>
+          <w:b/>
+        </w:rPr>
+        <w:t xml:space="preserve">Hint:  </w:t>
+      </w:r>
+      <w:r>
+        <w:rPr>
+          <w:i/>
+        </w:rPr>
+        <w:t>The love theme from the highest-grossing film of the 1990s.</w:t>
+      </w:r>
+    </w:p>
+    <w:p>
+      <w:pPr>
+        <w:spacing w:after="120"/>
+      </w:pPr>
+      <w:r>
+        <w:rPr>
+          <w:b/>
+          <w:color w:val="A86A14"/>
+        </w:rPr>
+        <w:t xml:space="preserve">Answer:  </w:t>
+      </w:r>
+      <w:r>
+        <w:rPr>
+          <w:i w:val="0"/>
+          <w:color w:val="A86A14"/>
+        </w:rPr>
+        <w:t>“My Heart Will Go On” — Céline Dion</w:t>
+      </w:r>
+    </w:p>
+    <w:p>
+      <w:pPr>
+        <w:spacing w:after="120"/>
+      </w:pPr>
+      <w:r>
+        <w:rPr>
+          <w:b/>
+        </w:rPr>
+        <w:t xml:space="preserve">Did you know?  </w:t>
+      </w:r>
+      <w:r>
+        <w:rPr>
+          <w:i w:val="0"/>
+        </w:rPr>
+        <w:t>The theme from “Titanic” (1997) — an ocean liner, and another track all at sea.</w:t>
+      </w:r>
+    </w:p>
+    <w:p>
+      <w:pPr>
+        <w:pStyle w:val="Heading3"/>
+      </w:pPr>
+      <w:r>
+        <w:t>Question 3 of 5</w:t>
+      </w:r>
+    </w:p>
+    <w:p>
+      <w:pPr>
+        <w:spacing w:after="120"/>
+      </w:pPr>
+      <w:r>
+        <w:rPr>
+          <w:b w:val="0"/>
+          <w:i w:val="0"/>
+        </w:rPr>
+        <w:t>Name this song (play the excerpt). Bonus point for the artist.</w:t>
+      </w:r>
+    </w:p>
+    <w:p>
+      <w:pPr>
+        <w:spacing w:after="120"/>
+      </w:pPr>
+      <w:r>
+        <w:rPr>
+          <w:b/>
+        </w:rPr>
+        <w:t xml:space="preserve">Hint:  </w:t>
+      </w:r>
+      <w:r>
+        <w:rPr>
+          <w:i/>
+        </w:rPr>
+        <w:t>A Lithuanian act — and the title is the Lithuanian word for “the sea”.</w:t>
+      </w:r>
+    </w:p>
+    <w:p>
+      <w:pPr>
+        <w:spacing w:after="120"/>
+      </w:pPr>
+      <w:r>
+        <w:rPr>
+          <w:b/>
+          <w:color w:val="A86A14"/>
+        </w:rPr>
+        <w:t xml:space="preserve">Answer:  </w:t>
+      </w:r>
+      <w:r>
+        <w:rPr>
+          <w:i w:val="0"/>
+          <w:color w:val="A86A14"/>
+        </w:rPr>
+        <w:t>“Jūra” — HappyEndless</w:t>
+      </w:r>
+    </w:p>
+    <w:p>
+      <w:pPr>
+        <w:spacing w:after="120"/>
+      </w:pPr>
+      <w:r>
+        <w:rPr>
+          <w:b/>
+        </w:rPr>
+        <w:t xml:space="preserve">Did you know?  </w:t>
+      </w:r>
+      <w:r>
+        <w:rPr>
+          <w:i w:val="0"/>
+        </w:rPr>
+        <w:t>“Jūra” is Lithuanian for “the sea” — the most direct clue to the round's hidden theme.</w:t>
+      </w:r>
+    </w:p>
+    <w:p>
+      <w:pPr>
+        <w:pStyle w:val="Heading3"/>
+      </w:pPr>
+      <w:r>
+        <w:t>Question 4 of 5</w:t>
+      </w:r>
+    </w:p>
+    <w:p>
+      <w:pPr>
+        <w:spacing w:after="120"/>
+      </w:pPr>
+      <w:r>
+        <w:rPr>
+          <w:b w:val="0"/>
+          <w:i w:val="0"/>
+        </w:rPr>
+        <w:t>Name this song (play the excerpt). Bonus point for the artist.</w:t>
+      </w:r>
+    </w:p>
+    <w:p>
+      <w:pPr>
+        <w:spacing w:after="120"/>
+      </w:pPr>
+      <w:r>
+        <w:rPr>
+          <w:b/>
+        </w:rPr>
+        <w:t xml:space="preserve">Hint:  </w:t>
+      </w:r>
+      <w:r>
+        <w:rPr>
+          <w:i/>
+        </w:rPr>
+        <w:t>A 1966 sing-along by the most famous band from Liverpool.</w:t>
+      </w:r>
+    </w:p>
+    <w:p>
+      <w:pPr>
+        <w:spacing w:after="120"/>
+      </w:pPr>
+      <w:r>
+        <w:rPr>
+          <w:b/>
+          <w:color w:val="A86A14"/>
+        </w:rPr>
+        <w:t xml:space="preserve">Answer:  </w:t>
+      </w:r>
+      <w:r>
+        <w:rPr>
+          <w:i w:val="0"/>
+          <w:color w:val="A86A14"/>
+        </w:rPr>
+        <w:t>“Yellow Submarine” — The Beatles</w:t>
+      </w:r>
+    </w:p>
+    <w:p>
+      <w:pPr>
+        <w:spacing w:after="120"/>
+      </w:pPr>
+      <w:r>
+        <w:rPr>
+          <w:b/>
+        </w:rPr>
+        <w:t xml:space="preserve">Did you know?  </w:t>
+      </w:r>
+      <w:r>
+        <w:rPr>
+          <w:i w:val="0"/>
+        </w:rPr>
+        <w:t>1966 — “we all live in a yellow submarine”, somewhere beneath the sea.</w:t>
+      </w:r>
+    </w:p>
+    <w:p>
+      <w:pPr>
+        <w:pStyle w:val="Heading3"/>
+      </w:pPr>
+      <w:r>
+        <w:t>Question 5 of 5</w:t>
+      </w:r>
+    </w:p>
+    <w:p>
+      <w:pPr>
+        <w:spacing w:after="120"/>
+      </w:pPr>
+      <w:r>
+        <w:rPr>
+          <w:b w:val="0"/>
+          <w:i w:val="0"/>
+        </w:rPr>
+        <w:t>Name this song (play the excerpt). Bonus point for the artist.</w:t>
+      </w:r>
+    </w:p>
+    <w:p>
+      <w:pPr>
+        <w:spacing w:after="120"/>
+      </w:pPr>
+      <w:r>
+        <w:rPr>
+          <w:b/>
+        </w:rPr>
+        <w:t xml:space="preserve">Hint:  </w:t>
+      </w:r>
+      <w:r>
+        <w:rPr>
+          <w:i/>
+        </w:rPr>
+        <w:t>The 2015 breakout track, written when the singer was 13.</w:t>
+      </w:r>
+    </w:p>
+    <w:p>
+      <w:pPr>
+        <w:spacing w:after="120"/>
+      </w:pPr>
+      <w:r>
+        <w:rPr>
+          <w:b/>
+          <w:color w:val="A86A14"/>
+        </w:rPr>
+        <w:t xml:space="preserve">Answer:  </w:t>
+      </w:r>
+      <w:r>
+        <w:rPr>
+          <w:i w:val="0"/>
+          <w:color w:val="A86A14"/>
+        </w:rPr>
+        <w:t>“Ocean Eyes” — Billie Eilish</w:t>
+      </w:r>
+    </w:p>
+    <w:p>
+      <w:pPr>
+        <w:spacing w:after="120"/>
+      </w:pPr>
+      <w:r>
+        <w:rPr>
+          <w:b/>
+        </w:rPr>
+        <w:t xml:space="preserve">Did you know?  </w:t>
+      </w:r>
+      <w:r>
+        <w:rPr>
+          <w:i w:val="0"/>
+        </w:rPr>
+        <w:t>Billie Eilish's debut, 2015 — the fifth and final clue that every song in this round is about the sea.</w:t>
+      </w:r>
+    </w:p>
+    <w:p>
+      <w:pPr>
+        <w:pStyle w:val="Heading1"/>
+      </w:pPr>
+      <w:r>
         <w:t>Bonus Round — The Brussels Bubble</w:t>
       </w:r>
     </w:p>
@@ -1900,7 +2299,7 @@
         <w:pStyle w:val="ListBullet"/>
       </w:pPr>
       <w:r>
-        <w:t>Questions regrouped into balanced themed rounds: Round 1 — Europe &amp; Fun Facts (6 multiple-choice), Round 2 — Lithuania (8), Round 3 — Environment &amp; Nature (4), plus a Brussels Bubble bonus round (3 insider questions; the Coreper question is worth 2 points).</w:t>
+        <w:t>Questions regrouped into balanced themed rounds: Round 1 — Europe &amp; Fun Facts (6 multiple-choice), Round 2 — Lithuania (8), Round 3 — Environment &amp; Nature (4), Round 4 — Music / Name That Tune (5 song excerpts), plus a Brussels Bubble bonus round (3 insider questions; the Coreper question is worth 2 points).</w:t>
       </w:r>
     </w:p>
     <w:p>
@@ -1944,7 +2343,15 @@
         <w:pStyle w:val="ListBullet"/>
       </w:pPr>
       <w:r>
-        <w:t>Videos wired in with play buttons: LT United “We Are The Winners” (excerpt to be chosen), the EU-accession promo (English subtitles needed), and the Umaru Dikko story on its answer slide.</w:t>
+        <w:t>Audio and video embedded to play inline in PowerPoint (no YouTube links): the five music-round excerpts, plus LT United “We Are The Winners” (excerpt to be chosen), the EU-accession promo (English subtitles still needed) and the Umaru Dikko story on its answer slide. Original YouTube URLs kept in the speaker notes as a backup.</w:t>
+      </w:r>
+    </w:p>
+    <w:p>
+      <w:pPr>
+        <w:pStyle w:val="ListBullet"/>
+      </w:pPr>
+      <w:r>
+        <w:t>A Music round added (Name That Tune): five song excerpts, all secretly about the sea, tying into the Čiurlionis “Jūra” idea from the draft.</w:t>
       </w:r>
     </w:p>
     <w:p>
@@ -2028,7 +2435,7 @@
         <w:pStyle w:val="ListBullet"/>
       </w:pPr>
       <w:r>
-        <w:t>Čiurlionis + the oceans act / a music question; German street in Vilnius.</w:t>
+        <w:t>German street in Vilnius.</w:t>
       </w:r>
     </w:p>
     <w:p>

</xml_diff>

<commit_message>
Add countdown timer, clearer round/question headers, and content fixes
- Add a 1-minute countdown timer (animated GIF, top-centre) to every
  question slide; it auto-plays in slideshow and uses no custom timing XML,
  so it cannot trigger PowerPoint's repair prompt.
- Make the round and question number clearly visible with bright header
  chips, so teams writing answers on paper always know where they are.
- Add the missing option D (Vienna Convention) to the Umaru Dikko question,
  matching the latest draft; mirror it in the run-of-show.
- Swap the revealing pink-flower icon on the pink-soup question for a
  neutral soup icon.
- Replace the Jūra music-round album art with Čiurlionis's Sonata of the
  Sea painting, organised into photos/ with the others and credited.
- Remove the superseded question drafts; point the scripts and README at
  "Klausimai protmūšiui (2).docx".
</commit_message>
<xml_diff>
--- a/Trivia_Night_2026-06-16_run_of_show.docx
+++ b/Trivia_Night_2026-06-16_run_of_show.docx
@@ -33,7 +33,7 @@
           <w:i/>
           <w:color w:val="6E7582"/>
         </w:rPr>
-        <w:t>This document follows the final slide deck (Trivia_Night_2026-06-16.pptx) in presentation order. It was built from the question draft in “Klausimai protmūšiui.docx”; the changes made relative to the draft are summarised at the end.</w:t>
+        <w:t>This document follows the final slide deck (Trivia_Night_2026-06-16.pptx) in presentation order. It was built from the question draft in “Klausimai protmūšiui (2).docx”; the changes made relative to the draft are summarised at the end.</w:t>
       </w:r>
     </w:p>
     <w:p>
@@ -667,11 +667,20 @@
     </w:p>
     <w:p>
       <w:pPr>
+        <w:spacing w:after="40"/>
+        <w:ind w:left="360"/>
+      </w:pPr>
+      <w:r>
+        <w:t>C.  The aircraft meant to transport him never arrived</w:t>
+      </w:r>
+    </w:p>
+    <w:p>
+      <w:pPr>
         <w:spacing w:after="120"/>
         <w:ind w:left="360"/>
       </w:pPr>
       <w:r>
-        <w:t>C.  The aircraft meant to transport him never arrived</w:t>
+        <w:t>D.  Customs officers had never heard of the Vienna Convention</w:t>
       </w:r>
     </w:p>
     <w:p>
@@ -1917,7 +1926,7 @@
           <w:i/>
           <w:color w:val="6E7582"/>
         </w:rPr>
-        <w:t>5 riddles · 1 point each · a song excerpt plays automatically and loops on each slide as the clue (embedded in the deck)</w:t>
+        <w:t>5 riddles · 1 point each · click the embedded song excerpt on each slide to hear the clue</w:t>
       </w:r>
     </w:p>
     <w:p>
@@ -2549,7 +2558,7 @@
         <w:pStyle w:val="Heading1"/>
       </w:pPr>
       <w:r>
-        <w:t>Changes relative to “Klausimai protmūšiui.docx”</w:t>
+        <w:t>Changes relative to “Klausimai protmūšiui (2).docx”</w:t>
       </w:r>
     </w:p>
     <w:p>
@@ -2637,7 +2646,7 @@
         <w:pStyle w:val="ListBullet"/>
       </w:pPr>
       <w:r>
-        <w:t>Round 4 reframed from “name this song” into five riddles whose answers all relate to the sea; the matching song excerpt plays automatically and loops on each slide as the clue.</w:t>
+        <w:t>Round 4 reframed from “name this song” into five riddles whose answers all relate to the sea; each slide has a matching embedded song excerpt to play as the clue.</w:t>
       </w:r>
     </w:p>
     <w:p>
@@ -2653,7 +2662,7 @@
         <w:pStyle w:val="ListBullet"/>
       </w:pPr>
       <w:r>
-        <w:t>Audio and video embedded to play inline in PowerPoint (no YouTube links): the five music-round excerpts (auto-play + loop), plus LT United “We Are The Winners” (excerpt to be chosen), the EU-accession promo (English subtitles still needed) and the Umaru Dikko story on its answer slide. Original YouTube URLs kept in the speaker notes as a backup.</w:t>
+        <w:t>Audio and video embedded to play inline in PowerPoint (no YouTube links): the five music-round excerpts, plus LT United “We Are The Winners” (excerpt to be chosen), the EU-accession promo (English subtitles still needed) and the Umaru Dikko story on its answer slide. Original YouTube URLs kept in the speaker notes as a backup.</w:t>
       </w:r>
     </w:p>
     <w:p>

</xml_diff>